<commit_message>
Round 1: fix white-on-gray table headers in Keeler_personnel.docx (judgment item 10)
All 4 data tables (Date/Event, Item/Status, Cycle/Rating/Notes, Test
type/History) had header-row text set to white (FFFFFF) against a
D9D9D9 (light gray) fill, effectively unreadable. Changed to black
(000000); fills and labels unchanged. 18 runs across 4 tables.

Disputing the companion finding on tran_text_thread.pdf: rendered all
5 pages and the header/footer chrome is normal, readable medium-gray
throughout, appropriately de-emphasized for meta-text but not washed
out. No changes made to that file.

This closes out the round 1 judgment bucket: 8 fixed, 2 disputed
(this one plus the onboard-video App Data scope item and the medical
ledger/EOB accounting item, which ties to the already-registered
billed-vs-paid trap).

Co-Authored-By: Claude Sonnet 5 <noreply@anthropic.com>
Claude-Session: https://claude.ai/code/session_014aTgVc2oHnK1x8Z8zpriX3
</commit_message>
<xml_diff>
--- a/filesystem/ACTD/HR/Keeler_personnel.docx
+++ b/filesystem/ACTD/HR/Keeler_personnel.docx
@@ -1134,7 +1134,7 @@
               <w:rPr>
                 <w:rFonts w:ascii="Helvetica" w:hAnsi="Helvetica" w:cs="Helvetica" w:eastAsia="Helvetica"/>
                 <w:b/>
-                <w:color w:val="FFFFFF"/>
+                <w:color w:val="000000"/>
                 <w:sz w:val="19"/>
               </w:rPr>
             </w:r>
@@ -1142,7 +1142,7 @@
               <w:rPr>
                 <w:rFonts w:ascii="Helvetica" w:hAnsi="Helvetica" w:cs="Helvetica" w:eastAsia="Helvetica"/>
                 <w:b/>
-                <w:color w:val="FFFFFF"/>
+                <w:color w:val="000000"/>
                 <w:sz w:val="19"/>
               </w:rPr>
               <w:t>Date</w:t>
@@ -1184,7 +1184,7 @@
               <w:rPr>
                 <w:rFonts w:ascii="Helvetica" w:hAnsi="Helvetica" w:cs="Helvetica" w:eastAsia="Helvetica"/>
                 <w:b/>
-                <w:color w:val="FFFFFF"/>
+                <w:color w:val="000000"/>
                 <w:sz w:val="19"/>
               </w:rPr>
             </w:r>
@@ -1192,7 +1192,7 @@
               <w:rPr>
                 <w:rFonts w:ascii="Helvetica" w:hAnsi="Helvetica" w:cs="Helvetica" w:eastAsia="Helvetica"/>
                 <w:b/>
-                <w:color w:val="FFFFFF"/>
+                <w:color w:val="000000"/>
                 <w:sz w:val="19"/>
               </w:rPr>
               <w:t>Event</w:t>
@@ -2002,7 +2002,7 @@
               <w:rPr>
                 <w:rFonts w:ascii="Helvetica" w:hAnsi="Helvetica" w:cs="Helvetica" w:eastAsia="Helvetica"/>
                 <w:b/>
-                <w:color w:val="FFFFFF"/>
+                <w:color w:val="000000"/>
                 <w:sz w:val="19"/>
               </w:rPr>
             </w:r>
@@ -2010,7 +2010,7 @@
               <w:rPr>
                 <w:rFonts w:ascii="Helvetica" w:hAnsi="Helvetica" w:cs="Helvetica" w:eastAsia="Helvetica"/>
                 <w:b/>
-                <w:color w:val="FFFFFF"/>
+                <w:color w:val="000000"/>
                 <w:sz w:val="19"/>
               </w:rPr>
               <w:t>Item</w:t>
@@ -2052,7 +2052,7 @@
               <w:rPr>
                 <w:rFonts w:ascii="Helvetica" w:hAnsi="Helvetica" w:cs="Helvetica" w:eastAsia="Helvetica"/>
                 <w:b/>
-                <w:color w:val="FFFFFF"/>
+                <w:color w:val="000000"/>
                 <w:sz w:val="19"/>
               </w:rPr>
             </w:r>
@@ -2060,7 +2060,7 @@
               <w:rPr>
                 <w:rFonts w:ascii="Helvetica" w:hAnsi="Helvetica" w:cs="Helvetica" w:eastAsia="Helvetica"/>
                 <w:b/>
-                <w:color w:val="FFFFFF"/>
+                <w:color w:val="000000"/>
                 <w:sz w:val="19"/>
               </w:rPr>
               <w:t>Status</w:t>
@@ -2975,7 +2975,7 @@
               <w:rPr>
                 <w:rFonts w:ascii="Helvetica" w:hAnsi="Helvetica" w:cs="Helvetica" w:eastAsia="Helvetica"/>
                 <w:b/>
-                <w:color w:val="FFFFFF"/>
+                <w:color w:val="000000"/>
                 <w:sz w:val="19"/>
               </w:rPr>
             </w:r>
@@ -2983,7 +2983,7 @@
               <w:rPr>
                 <w:rFonts w:ascii="Helvetica" w:hAnsi="Helvetica" w:cs="Helvetica" w:eastAsia="Helvetica"/>
                 <w:b/>
-                <w:color w:val="FFFFFF"/>
+                <w:color w:val="000000"/>
                 <w:sz w:val="19"/>
               </w:rPr>
               <w:t>Cycle</w:t>
@@ -3025,7 +3025,7 @@
               <w:rPr>
                 <w:rFonts w:ascii="Helvetica" w:hAnsi="Helvetica" w:cs="Helvetica" w:eastAsia="Helvetica"/>
                 <w:b/>
-                <w:color w:val="FFFFFF"/>
+                <w:color w:val="000000"/>
                 <w:sz w:val="19"/>
               </w:rPr>
             </w:r>
@@ -3033,7 +3033,7 @@
               <w:rPr>
                 <w:rFonts w:ascii="Helvetica" w:hAnsi="Helvetica" w:cs="Helvetica" w:eastAsia="Helvetica"/>
                 <w:b/>
-                <w:color w:val="FFFFFF"/>
+                <w:color w:val="000000"/>
                 <w:sz w:val="19"/>
               </w:rPr>
               <w:t>Rating</w:t>
@@ -3075,7 +3075,7 @@
               <w:rPr>
                 <w:rFonts w:ascii="Helvetica" w:hAnsi="Helvetica" w:cs="Helvetica" w:eastAsia="Helvetica"/>
                 <w:b/>
-                <w:color w:val="FFFFFF"/>
+                <w:color w:val="000000"/>
                 <w:sz w:val="19"/>
               </w:rPr>
             </w:r>
@@ -3083,7 +3083,7 @@
               <w:rPr>
                 <w:rFonts w:ascii="Helvetica" w:hAnsi="Helvetica" w:cs="Helvetica" w:eastAsia="Helvetica"/>
                 <w:b/>
-                <w:color w:val="FFFFFF"/>
+                <w:color w:val="000000"/>
                 <w:sz w:val="19"/>
               </w:rPr>
               <w:t>Notes</w:t>
@@ -4301,7 +4301,7 @@
               <w:rPr>
                 <w:rFonts w:ascii="Helvetica" w:hAnsi="Helvetica" w:cs="Helvetica" w:eastAsia="Helvetica"/>
                 <w:b/>
-                <w:color w:val="FFFFFF"/>
+                <w:color w:val="000000"/>
                 <w:sz w:val="19"/>
               </w:rPr>
             </w:r>
@@ -4309,7 +4309,7 @@
               <w:rPr>
                 <w:rFonts w:ascii="Helvetica" w:hAnsi="Helvetica" w:cs="Helvetica" w:eastAsia="Helvetica"/>
                 <w:b/>
-                <w:color w:val="FFFFFF"/>
+                <w:color w:val="000000"/>
                 <w:sz w:val="19"/>
               </w:rPr>
               <w:t>Test type</w:t>
@@ -4351,7 +4351,7 @@
               <w:rPr>
                 <w:rFonts w:ascii="Helvetica" w:hAnsi="Helvetica" w:cs="Helvetica" w:eastAsia="Helvetica"/>
                 <w:b/>
-                <w:color w:val="FFFFFF"/>
+                <w:color w:val="000000"/>
                 <w:sz w:val="19"/>
               </w:rPr>
             </w:r>
@@ -4359,7 +4359,7 @@
               <w:rPr>
                 <w:rFonts w:ascii="Helvetica" w:hAnsi="Helvetica" w:cs="Helvetica" w:eastAsia="Helvetica"/>
                 <w:b/>
-                <w:color w:val="FFFFFF"/>
+                <w:color w:val="000000"/>
                 <w:sz w:val="19"/>
               </w:rPr>
               <w:t>History</w:t>

</xml_diff>